<commit_message>
change in multi draft
</commit_message>
<xml_diff>
--- a/files/Multi_Draft.docx
+++ b/files/Multi_Draft.docx
@@ -4,48 +4,12 @@
   <w:body>
     <w:p>
       <w:pPr>
-        <w:spacing w:after="0" w:line="240" w:lineRule="auto"/>
-        <w:jc w:val="both"/>
-        <w:rPr>
-          <w:rFonts w:ascii="Segoe UI" w:hAnsi="Segoe UI" w:cs="Segoe UI"/>
-          <w:b/>
-          <w:u w:val="single"/>
-        </w:rPr>
-      </w:pPr>
-      <w:r>
-        <w:rPr>
-          <w:rFonts w:ascii="Segoe UI" w:hAnsi="Segoe UI" w:cs="Segoe UI"/>
-          <w:b/>
-          <w:u w:val="single"/>
-        </w:rPr>
-        <w:t>EMAIL</w:t>
-      </w:r>
-    </w:p>
-    <w:p>
-      <w:pPr>
-        <w:spacing w:after="0" w:line="240" w:lineRule="auto"/>
-        <w:jc w:val="both"/>
-        <w:rPr>
-          <w:rFonts w:ascii="Segoe UI" w:hAnsi="Segoe UI" w:cs="Segoe UI"/>
-          <w:b/>
-          <w:u w:val="single"/>
-        </w:rPr>
-      </w:pPr>
-      <w:r>
-        <w:rPr>
-          <w:rFonts w:ascii="Segoe UI" w:hAnsi="Segoe UI" w:cs="Segoe UI"/>
-          <w:b/>
-          <w:u w:val="single"/>
-        </w:rPr>
-        <w:t>Most Urgent</w:t>
-      </w:r>
-    </w:p>
-    <w:p>
-      <w:pPr>
         <w:spacing w:after="0"/>
         <w:jc w:val="both"/>
         <w:rPr>
           <w:rFonts w:ascii="Segoe UI" w:hAnsi="Segoe UI" w:cs="Segoe UI"/>
+          <w:sz w:val="24"/>
+          <w:szCs w:val="24"/>
         </w:rPr>
       </w:pPr>
     </w:p>
@@ -55,11 +19,15 @@
         <w:jc w:val="both"/>
         <w:rPr>
           <w:rFonts w:ascii="Segoe UI" w:hAnsi="Segoe UI" w:cs="Segoe UI"/>
-        </w:rPr>
-      </w:pPr>
-      <w:r>
-        <w:rPr>
-          <w:rFonts w:ascii="Segoe UI" w:hAnsi="Segoe UI" w:cs="Segoe UI"/>
+          <w:sz w:val="24"/>
+          <w:szCs w:val="24"/>
+        </w:rPr>
+      </w:pPr>
+      <w:r>
+        <w:rPr>
+          <w:rFonts w:ascii="Segoe UI" w:hAnsi="Segoe UI" w:cs="Segoe UI"/>
+          <w:sz w:val="24"/>
+          <w:szCs w:val="24"/>
         </w:rPr>
         <w:t>From</w:t>
       </w:r>
@@ -70,17 +38,23 @@
         <w:jc w:val="both"/>
         <w:rPr>
           <w:rFonts w:ascii="Segoe UI" w:hAnsi="Segoe UI" w:cs="Segoe UI"/>
-        </w:rPr>
-      </w:pPr>
-      <w:r>
-        <w:rPr>
-          <w:rFonts w:ascii="Segoe UI" w:hAnsi="Segoe UI" w:cs="Segoe UI"/>
-        </w:rPr>
-        <w:tab/>
-      </w:r>
-      <w:r>
-        <w:rPr>
-          <w:rFonts w:ascii="Segoe UI" w:hAnsi="Segoe UI" w:cs="Segoe UI"/>
+          <w:sz w:val="24"/>
+          <w:szCs w:val="24"/>
+        </w:rPr>
+      </w:pPr>
+      <w:r>
+        <w:rPr>
+          <w:rFonts w:ascii="Segoe UI" w:hAnsi="Segoe UI" w:cs="Segoe UI"/>
+          <w:sz w:val="24"/>
+          <w:szCs w:val="24"/>
+        </w:rPr>
+        <w:tab/>
+      </w:r>
+      <w:r>
+        <w:rPr>
+          <w:rFonts w:ascii="Segoe UI" w:hAnsi="Segoe UI" w:cs="Segoe UI"/>
+          <w:sz w:val="24"/>
+          <w:szCs w:val="24"/>
         </w:rPr>
         <w:tab/>
         <w:t xml:space="preserve">The </w:t>
@@ -89,6 +63,8 @@
       <w:r>
         <w:rPr>
           <w:rFonts w:ascii="Segoe UI" w:hAnsi="Segoe UI" w:cs="Segoe UI"/>
+          <w:sz w:val="24"/>
+          <w:szCs w:val="24"/>
         </w:rPr>
         <w:t>Commissioner &amp;</w:t>
       </w:r>
@@ -96,6 +72,8 @@
       <w:r>
         <w:rPr>
           <w:rFonts w:ascii="Segoe UI" w:hAnsi="Segoe UI" w:cs="Segoe UI"/>
+          <w:sz w:val="24"/>
+          <w:szCs w:val="24"/>
         </w:rPr>
         <w:t xml:space="preserve"> Secretary to Govt. of Haryana,</w:t>
       </w:r>
@@ -106,17 +84,23 @@
         <w:jc w:val="both"/>
         <w:rPr>
           <w:rFonts w:ascii="Segoe UI" w:hAnsi="Segoe UI" w:cs="Segoe UI"/>
-        </w:rPr>
-      </w:pPr>
-      <w:r>
-        <w:rPr>
-          <w:rFonts w:ascii="Segoe UI" w:hAnsi="Segoe UI" w:cs="Segoe UI"/>
-        </w:rPr>
-        <w:tab/>
-      </w:r>
-      <w:r>
-        <w:rPr>
-          <w:rFonts w:ascii="Segoe UI" w:hAnsi="Segoe UI" w:cs="Segoe UI"/>
+          <w:sz w:val="24"/>
+          <w:szCs w:val="24"/>
+        </w:rPr>
+      </w:pPr>
+      <w:r>
+        <w:rPr>
+          <w:rFonts w:ascii="Segoe UI" w:hAnsi="Segoe UI" w:cs="Segoe UI"/>
+          <w:sz w:val="24"/>
+          <w:szCs w:val="24"/>
+        </w:rPr>
+        <w:tab/>
+      </w:r>
+      <w:r>
+        <w:rPr>
+          <w:rFonts w:ascii="Segoe UI" w:hAnsi="Segoe UI" w:cs="Segoe UI"/>
+          <w:sz w:val="24"/>
+          <w:szCs w:val="24"/>
         </w:rPr>
         <w:tab/>
       </w:r>
@@ -124,6 +108,8 @@
       <w:r>
         <w:rPr>
           <w:rFonts w:ascii="Segoe UI" w:hAnsi="Segoe UI" w:cs="Segoe UI"/>
+          <w:sz w:val="24"/>
+          <w:szCs w:val="24"/>
         </w:rPr>
         <w:t>Industries &amp; Commerce Department, Chandigarh.</w:t>
       </w:r>
@@ -135,11 +121,26 @@
         <w:jc w:val="both"/>
         <w:rPr>
           <w:rFonts w:ascii="Segoe UI" w:hAnsi="Segoe UI" w:cs="Segoe UI"/>
-        </w:rPr>
-      </w:pPr>
-      <w:r>
-        <w:rPr>
-          <w:rFonts w:ascii="Segoe UI" w:hAnsi="Segoe UI" w:cs="Segoe UI"/>
+          <w:sz w:val="24"/>
+          <w:szCs w:val="24"/>
+        </w:rPr>
+      </w:pPr>
+    </w:p>
+    <w:p>
+      <w:pPr>
+        <w:spacing w:after="0" w:line="240" w:lineRule="auto"/>
+        <w:jc w:val="both"/>
+        <w:rPr>
+          <w:rFonts w:ascii="Segoe UI" w:hAnsi="Segoe UI" w:cs="Segoe UI"/>
+          <w:sz w:val="24"/>
+          <w:szCs w:val="24"/>
+        </w:rPr>
+      </w:pPr>
+      <w:r>
+        <w:rPr>
+          <w:rFonts w:ascii="Segoe UI" w:hAnsi="Segoe UI" w:cs="Segoe UI"/>
+          <w:sz w:val="24"/>
+          <w:szCs w:val="24"/>
         </w:rPr>
         <w:t>To</w:t>
       </w:r>
@@ -150,11 +151,15 @@
         <w:jc w:val="both"/>
         <w:rPr>
           <w:rFonts w:ascii="Segoe UI" w:hAnsi="Segoe UI" w:cs="Segoe UI"/>
-        </w:rPr>
-      </w:pPr>
-      <w:r>
-        <w:rPr>
-          <w:rFonts w:ascii="Segoe UI" w:hAnsi="Segoe UI" w:cs="Segoe UI"/>
+          <w:sz w:val="24"/>
+          <w:szCs w:val="24"/>
+        </w:rPr>
+      </w:pPr>
+      <w:r>
+        <w:rPr>
+          <w:rFonts w:ascii="Segoe UI" w:hAnsi="Segoe UI" w:cs="Segoe UI"/>
+          <w:sz w:val="24"/>
+          <w:szCs w:val="24"/>
         </w:rPr>
         <w:tab/>
         <w:t>1.</w:t>
@@ -162,6 +167,8 @@
       <w:r>
         <w:rPr>
           <w:rFonts w:ascii="Segoe UI" w:hAnsi="Segoe UI" w:cs="Segoe UI"/>
+          <w:sz w:val="24"/>
+          <w:szCs w:val="24"/>
         </w:rPr>
         <w:tab/>
         <w:t xml:space="preserve">The Director General </w:t>
@@ -174,11 +181,15 @@
         <w:jc w:val="both"/>
         <w:rPr>
           <w:rFonts w:ascii="Segoe UI" w:hAnsi="Segoe UI" w:cs="Segoe UI"/>
-        </w:rPr>
-      </w:pPr>
-      <w:r>
-        <w:rPr>
-          <w:rFonts w:ascii="Segoe UI" w:hAnsi="Segoe UI" w:cs="Segoe UI"/>
+          <w:sz w:val="24"/>
+          <w:szCs w:val="24"/>
+        </w:rPr>
+      </w:pPr>
+      <w:r>
+        <w:rPr>
+          <w:rFonts w:ascii="Segoe UI" w:hAnsi="Segoe UI" w:cs="Segoe UI"/>
+          <w:sz w:val="24"/>
+          <w:szCs w:val="24"/>
         </w:rPr>
         <w:t>Micro, Small &amp; Medium Enterprises,</w:t>
       </w:r>
@@ -189,17 +200,23 @@
         <w:jc w:val="both"/>
         <w:rPr>
           <w:rFonts w:ascii="Segoe UI" w:hAnsi="Segoe UI" w:cs="Segoe UI"/>
-        </w:rPr>
-      </w:pPr>
-      <w:r>
-        <w:rPr>
-          <w:rFonts w:ascii="Segoe UI" w:hAnsi="Segoe UI" w:cs="Segoe UI"/>
-        </w:rPr>
-        <w:tab/>
-      </w:r>
-      <w:r>
-        <w:rPr>
-          <w:rFonts w:ascii="Segoe UI" w:hAnsi="Segoe UI" w:cs="Segoe UI"/>
+          <w:sz w:val="24"/>
+          <w:szCs w:val="24"/>
+        </w:rPr>
+      </w:pPr>
+      <w:r>
+        <w:rPr>
+          <w:rFonts w:ascii="Segoe UI" w:hAnsi="Segoe UI" w:cs="Segoe UI"/>
+          <w:sz w:val="24"/>
+          <w:szCs w:val="24"/>
+        </w:rPr>
+        <w:tab/>
+      </w:r>
+      <w:r>
+        <w:rPr>
+          <w:rFonts w:ascii="Segoe UI" w:hAnsi="Segoe UI" w:cs="Segoe UI"/>
+          <w:sz w:val="24"/>
+          <w:szCs w:val="24"/>
         </w:rPr>
         <w:tab/>
         <w:t>Plot No. C-3, HSVP Complex, Sector 6, Panchkula–134109</w:t>
@@ -212,11 +229,15 @@
         <w:jc w:val="both"/>
         <w:rPr>
           <w:rFonts w:ascii="Segoe UI" w:hAnsi="Segoe UI" w:cs="Segoe UI"/>
-        </w:rPr>
-      </w:pPr>
-      <w:r>
-        <w:rPr>
-          <w:rFonts w:ascii="Segoe UI" w:hAnsi="Segoe UI" w:cs="Segoe UI"/>
+          <w:sz w:val="24"/>
+          <w:szCs w:val="24"/>
+        </w:rPr>
+      </w:pPr>
+      <w:r>
+        <w:rPr>
+          <w:rFonts w:ascii="Segoe UI" w:hAnsi="Segoe UI" w:cs="Segoe UI"/>
+          <w:sz w:val="24"/>
+          <w:szCs w:val="24"/>
         </w:rPr>
         <w:t xml:space="preserve">Email: </w:t>
       </w:r>
@@ -225,6 +246,8 @@
           <w:rPr>
             <w:rStyle w:val="Hyperlink"/>
             <w:rFonts w:ascii="Segoe UI" w:hAnsi="Segoe UI" w:cs="Segoe UI"/>
+            <w:sz w:val="24"/>
+            <w:szCs w:val="24"/>
           </w:rPr>
           <w:t>dgmsme2021@gmail.com</w:t>
         </w:r>
@@ -237,6 +260,8 @@
         <w:jc w:val="both"/>
         <w:rPr>
           <w:rFonts w:ascii="Segoe UI" w:hAnsi="Segoe UI" w:cs="Segoe UI"/>
+          <w:sz w:val="24"/>
+          <w:szCs w:val="24"/>
         </w:rPr>
       </w:pPr>
     </w:p>
@@ -247,17 +272,23 @@
         <w:jc w:val="both"/>
         <w:rPr>
           <w:rFonts w:ascii="Segoe UI" w:hAnsi="Segoe UI" w:cs="Segoe UI"/>
-        </w:rPr>
-      </w:pPr>
-      <w:r>
-        <w:rPr>
-          <w:rFonts w:ascii="Segoe UI" w:hAnsi="Segoe UI" w:cs="Segoe UI"/>
+          <w:sz w:val="24"/>
+          <w:szCs w:val="24"/>
+        </w:rPr>
+      </w:pPr>
+      <w:r>
+        <w:rPr>
+          <w:rFonts w:ascii="Segoe UI" w:hAnsi="Segoe UI" w:cs="Segoe UI"/>
+          <w:sz w:val="24"/>
+          <w:szCs w:val="24"/>
         </w:rPr>
         <w:t>2.</w:t>
       </w:r>
       <w:r>
         <w:rPr>
           <w:rFonts w:ascii="Segoe UI" w:hAnsi="Segoe UI" w:cs="Segoe UI"/>
+          <w:sz w:val="24"/>
+          <w:szCs w:val="24"/>
         </w:rPr>
         <w:tab/>
         <w:t xml:space="preserve">The Director General, </w:t>
@@ -270,11 +301,15 @@
         <w:jc w:val="both"/>
         <w:rPr>
           <w:rFonts w:ascii="Segoe UI" w:hAnsi="Segoe UI" w:cs="Segoe UI"/>
-        </w:rPr>
-      </w:pPr>
-      <w:r>
-        <w:rPr>
-          <w:rFonts w:ascii="Segoe UI" w:hAnsi="Segoe UI" w:cs="Segoe UI"/>
+          <w:sz w:val="24"/>
+          <w:szCs w:val="24"/>
+        </w:rPr>
+      </w:pPr>
+      <w:r>
+        <w:rPr>
+          <w:rFonts w:ascii="Segoe UI" w:hAnsi="Segoe UI" w:cs="Segoe UI"/>
+          <w:sz w:val="24"/>
+          <w:szCs w:val="24"/>
         </w:rPr>
         <w:t>Industries &amp; Commerce Department, Haryana</w:t>
       </w:r>
@@ -286,11 +321,15 @@
         <w:jc w:val="both"/>
         <w:rPr>
           <w:rFonts w:ascii="Segoe UI" w:hAnsi="Segoe UI" w:cs="Segoe UI"/>
-        </w:rPr>
-      </w:pPr>
-      <w:r>
-        <w:rPr>
-          <w:rFonts w:ascii="Segoe UI" w:hAnsi="Segoe UI" w:cs="Segoe UI"/>
+          <w:sz w:val="24"/>
+          <w:szCs w:val="24"/>
+        </w:rPr>
+      </w:pPr>
+      <w:r>
+        <w:rPr>
+          <w:rFonts w:ascii="Segoe UI" w:hAnsi="Segoe UI" w:cs="Segoe UI"/>
+          <w:sz w:val="24"/>
+          <w:szCs w:val="24"/>
         </w:rPr>
         <w:t>30 Bays Building</w:t>
       </w:r>
@@ -298,6 +337,8 @@
       <w:r>
         <w:rPr>
           <w:rFonts w:ascii="Segoe UI" w:hAnsi="Segoe UI" w:cs="Segoe UI"/>
+          <w:sz w:val="24"/>
+          <w:szCs w:val="24"/>
         </w:rPr>
         <w:t>,Sector</w:t>
       </w:r>
@@ -305,6 +346,8 @@
       <w:r>
         <w:rPr>
           <w:rFonts w:ascii="Segoe UI" w:hAnsi="Segoe UI" w:cs="Segoe UI"/>
+          <w:sz w:val="24"/>
+          <w:szCs w:val="24"/>
         </w:rPr>
         <w:t>-17-C, Chandigarh.</w:t>
       </w:r>
@@ -316,11 +359,15 @@
         <w:jc w:val="both"/>
         <w:rPr>
           <w:rFonts w:ascii="Segoe UI" w:hAnsi="Segoe UI" w:cs="Segoe UI"/>
-        </w:rPr>
-      </w:pPr>
-      <w:r>
-        <w:rPr>
-          <w:rFonts w:ascii="Segoe UI" w:hAnsi="Segoe UI" w:cs="Segoe UI"/>
+          <w:sz w:val="24"/>
+          <w:szCs w:val="24"/>
+        </w:rPr>
+      </w:pPr>
+      <w:r>
+        <w:rPr>
+          <w:rFonts w:ascii="Segoe UI" w:hAnsi="Segoe UI" w:cs="Segoe UI"/>
+          <w:sz w:val="24"/>
+          <w:szCs w:val="24"/>
         </w:rPr>
         <w:t xml:space="preserve">Email: </w:t>
       </w:r>
@@ -329,6 +376,8 @@
           <w:rPr>
             <w:rStyle w:val="Hyperlink"/>
             <w:rFonts w:ascii="Segoe UI" w:hAnsi="Segoe UI" w:cs="Segoe UI"/>
+            <w:sz w:val="24"/>
+            <w:szCs w:val="24"/>
           </w:rPr>
           <w:t>ipcharyana@yahoo.com</w:t>
         </w:r>
@@ -341,6 +390,8 @@
         <w:jc w:val="both"/>
         <w:rPr>
           <w:rFonts w:ascii="Segoe UI" w:hAnsi="Segoe UI" w:cs="Segoe UI"/>
+          <w:sz w:val="24"/>
+          <w:szCs w:val="24"/>
         </w:rPr>
       </w:pPr>
     </w:p>
@@ -351,17 +402,23 @@
         <w:jc w:val="both"/>
         <w:rPr>
           <w:rFonts w:ascii="Segoe UI" w:hAnsi="Segoe UI" w:cs="Segoe UI"/>
-        </w:rPr>
-      </w:pPr>
-      <w:r>
-        <w:rPr>
-          <w:rFonts w:ascii="Segoe UI" w:hAnsi="Segoe UI" w:cs="Segoe UI"/>
+          <w:sz w:val="24"/>
+          <w:szCs w:val="24"/>
+        </w:rPr>
+      </w:pPr>
+      <w:r>
+        <w:rPr>
+          <w:rFonts w:ascii="Segoe UI" w:hAnsi="Segoe UI" w:cs="Segoe UI"/>
+          <w:sz w:val="24"/>
+          <w:szCs w:val="24"/>
         </w:rPr>
         <w:t>3.</w:t>
       </w:r>
       <w:r>
         <w:rPr>
           <w:rFonts w:ascii="Segoe UI" w:hAnsi="Segoe UI" w:cs="Segoe UI"/>
+          <w:sz w:val="24"/>
+          <w:szCs w:val="24"/>
         </w:rPr>
         <w:tab/>
         <w:t xml:space="preserve">The Managing Director, </w:t>
@@ -370,12 +427,16 @@
         <w:rPr>
           <w:rFonts w:ascii="Segoe UI" w:hAnsi="Segoe UI" w:cs="Segoe UI"/>
           <w:b/>
+          <w:sz w:val="24"/>
+          <w:szCs w:val="24"/>
         </w:rPr>
         <w:t>(HSIIDC)</w:t>
       </w:r>
       <w:r>
         <w:rPr>
           <w:rFonts w:ascii="Segoe UI" w:hAnsi="Segoe UI" w:cs="Segoe UI"/>
+          <w:sz w:val="24"/>
+          <w:szCs w:val="24"/>
         </w:rPr>
         <w:t>,</w:t>
       </w:r>
@@ -387,11 +448,15 @@
         <w:jc w:val="both"/>
         <w:rPr>
           <w:rFonts w:ascii="Segoe UI" w:hAnsi="Segoe UI" w:cs="Segoe UI"/>
-        </w:rPr>
-      </w:pPr>
-      <w:r>
-        <w:rPr>
-          <w:rFonts w:ascii="Segoe UI" w:hAnsi="Segoe UI" w:cs="Segoe UI"/>
+          <w:sz w:val="24"/>
+          <w:szCs w:val="24"/>
+        </w:rPr>
+      </w:pPr>
+      <w:r>
+        <w:rPr>
+          <w:rFonts w:ascii="Segoe UI" w:hAnsi="Segoe UI" w:cs="Segoe UI"/>
+          <w:sz w:val="24"/>
+          <w:szCs w:val="24"/>
         </w:rPr>
         <w:t>Plot No C-13-14, Sector 6, Panchkula-134109, Haryana</w:t>
       </w:r>
@@ -403,11 +468,15 @@
         <w:jc w:val="both"/>
         <w:rPr>
           <w:rFonts w:ascii="Segoe UI" w:hAnsi="Segoe UI" w:cs="Segoe UI"/>
-        </w:rPr>
-      </w:pPr>
-      <w:r>
-        <w:rPr>
-          <w:rFonts w:ascii="Segoe UI" w:hAnsi="Segoe UI" w:cs="Segoe UI"/>
+          <w:sz w:val="24"/>
+          <w:szCs w:val="24"/>
+        </w:rPr>
+      </w:pPr>
+      <w:r>
+        <w:rPr>
+          <w:rFonts w:ascii="Segoe UI" w:hAnsi="Segoe UI" w:cs="Segoe UI"/>
+          <w:sz w:val="24"/>
+          <w:szCs w:val="24"/>
         </w:rPr>
         <w:t xml:space="preserve">Email: </w:t>
       </w:r>
@@ -416,6 +485,8 @@
           <w:rPr>
             <w:rStyle w:val="Hyperlink"/>
             <w:rFonts w:ascii="Segoe UI" w:hAnsi="Segoe UI" w:cs="Segoe UI"/>
+            <w:sz w:val="24"/>
+            <w:szCs w:val="24"/>
           </w:rPr>
           <w:t>md.hsiidc@hsiidc.org.in</w:t>
         </w:r>
@@ -428,6 +499,8 @@
         <w:jc w:val="both"/>
         <w:rPr>
           <w:rFonts w:ascii="Segoe UI" w:hAnsi="Segoe UI" w:cs="Segoe UI"/>
+          <w:sz w:val="24"/>
+          <w:szCs w:val="24"/>
         </w:rPr>
       </w:pPr>
     </w:p>
@@ -438,17 +511,23 @@
         <w:jc w:val="both"/>
         <w:rPr>
           <w:rFonts w:ascii="Segoe UI" w:hAnsi="Segoe UI" w:cs="Segoe UI"/>
-        </w:rPr>
-      </w:pPr>
-      <w:r>
-        <w:rPr>
-          <w:rFonts w:ascii="Segoe UI" w:hAnsi="Segoe UI" w:cs="Segoe UI"/>
+          <w:sz w:val="24"/>
+          <w:szCs w:val="24"/>
+        </w:rPr>
+      </w:pPr>
+      <w:r>
+        <w:rPr>
+          <w:rFonts w:ascii="Segoe UI" w:hAnsi="Segoe UI" w:cs="Segoe UI"/>
+          <w:sz w:val="24"/>
+          <w:szCs w:val="24"/>
         </w:rPr>
         <w:t>4.</w:t>
       </w:r>
       <w:r>
         <w:rPr>
           <w:rFonts w:ascii="Segoe UI" w:hAnsi="Segoe UI" w:cs="Segoe UI"/>
+          <w:sz w:val="24"/>
+          <w:szCs w:val="24"/>
         </w:rPr>
         <w:tab/>
         <w:t xml:space="preserve">CEO, Haryana </w:t>
@@ -457,6 +536,8 @@
       <w:r>
         <w:rPr>
           <w:rFonts w:ascii="Segoe UI" w:hAnsi="Segoe UI" w:cs="Segoe UI"/>
+          <w:sz w:val="24"/>
+          <w:szCs w:val="24"/>
         </w:rPr>
         <w:t>Khadi</w:t>
       </w:r>
@@ -464,6 +545,8 @@
       <w:r>
         <w:rPr>
           <w:rFonts w:ascii="Segoe UI" w:hAnsi="Segoe UI" w:cs="Segoe UI"/>
+          <w:sz w:val="24"/>
+          <w:szCs w:val="24"/>
         </w:rPr>
         <w:t xml:space="preserve"> and Village Industries Board</w:t>
       </w:r>
@@ -475,11 +558,15 @@
         <w:jc w:val="both"/>
         <w:rPr>
           <w:rFonts w:ascii="Segoe UI" w:hAnsi="Segoe UI" w:cs="Segoe UI"/>
-        </w:rPr>
-      </w:pPr>
-      <w:r>
-        <w:rPr>
-          <w:rFonts w:ascii="Segoe UI" w:hAnsi="Segoe UI" w:cs="Segoe UI"/>
+          <w:sz w:val="24"/>
+          <w:szCs w:val="24"/>
+        </w:rPr>
+      </w:pPr>
+      <w:r>
+        <w:rPr>
+          <w:rFonts w:ascii="Segoe UI" w:hAnsi="Segoe UI" w:cs="Segoe UI"/>
+          <w:sz w:val="24"/>
+          <w:szCs w:val="24"/>
         </w:rPr>
         <w:t xml:space="preserve">Bay No 63-64, Sector-2, </w:t>
       </w:r>
@@ -487,6 +574,8 @@
       <w:r>
         <w:rPr>
           <w:rFonts w:ascii="Segoe UI" w:hAnsi="Segoe UI" w:cs="Segoe UI"/>
+          <w:sz w:val="24"/>
+          <w:szCs w:val="24"/>
         </w:rPr>
         <w:t>Panchkula</w:t>
       </w:r>
@@ -494,6 +583,8 @@
       <w:r>
         <w:rPr>
           <w:rFonts w:ascii="Segoe UI" w:hAnsi="Segoe UI" w:cs="Segoe UI"/>
+          <w:sz w:val="24"/>
+          <w:szCs w:val="24"/>
         </w:rPr>
         <w:t>, Haryana 134112</w:t>
       </w:r>
@@ -505,11 +596,15 @@
         <w:jc w:val="both"/>
         <w:rPr>
           <w:rFonts w:ascii="Segoe UI" w:hAnsi="Segoe UI" w:cs="Segoe UI"/>
-        </w:rPr>
-      </w:pPr>
-      <w:r>
-        <w:rPr>
-          <w:rFonts w:ascii="Segoe UI" w:hAnsi="Segoe UI" w:cs="Segoe UI"/>
+          <w:sz w:val="24"/>
+          <w:szCs w:val="24"/>
+        </w:rPr>
+      </w:pPr>
+      <w:r>
+        <w:rPr>
+          <w:rFonts w:ascii="Segoe UI" w:hAnsi="Segoe UI" w:cs="Segoe UI"/>
+          <w:sz w:val="24"/>
+          <w:szCs w:val="24"/>
         </w:rPr>
         <w:t xml:space="preserve">Email: </w:t>
       </w:r>
@@ -517,6 +612,8 @@
         <w:r>
           <w:rPr>
             <w:rFonts w:ascii="Segoe UI" w:hAnsi="Segoe UI" w:cs="Segoe UI"/>
+            <w:sz w:val="24"/>
+            <w:szCs w:val="24"/>
           </w:rPr>
           <w:t>harkhadi@yahoo.in</w:t>
         </w:r>
@@ -529,6 +626,8 @@
         <w:jc w:val="both"/>
         <w:rPr>
           <w:rFonts w:ascii="Segoe UI" w:hAnsi="Segoe UI" w:cs="Segoe UI"/>
+          <w:sz w:val="24"/>
+          <w:szCs w:val="24"/>
         </w:rPr>
       </w:pPr>
     </w:p>
@@ -539,17 +638,23 @@
         <w:jc w:val="both"/>
         <w:rPr>
           <w:rFonts w:ascii="Segoe UI" w:hAnsi="Segoe UI" w:cs="Segoe UI"/>
-        </w:rPr>
-      </w:pPr>
-      <w:r>
-        <w:rPr>
-          <w:rFonts w:ascii="Segoe UI" w:hAnsi="Segoe UI" w:cs="Segoe UI"/>
+          <w:sz w:val="24"/>
+          <w:szCs w:val="24"/>
+        </w:rPr>
+      </w:pPr>
+      <w:r>
+        <w:rPr>
+          <w:rFonts w:ascii="Segoe UI" w:hAnsi="Segoe UI" w:cs="Segoe UI"/>
+          <w:sz w:val="24"/>
+          <w:szCs w:val="24"/>
         </w:rPr>
         <w:t>5.</w:t>
       </w:r>
       <w:r>
         <w:rPr>
           <w:rFonts w:ascii="Segoe UI" w:hAnsi="Segoe UI" w:cs="Segoe UI"/>
+          <w:sz w:val="24"/>
+          <w:szCs w:val="24"/>
         </w:rPr>
         <w:tab/>
         <w:t>The Managing Director,</w:t>
@@ -562,11 +667,15 @@
         <w:jc w:val="both"/>
         <w:rPr>
           <w:rFonts w:ascii="Segoe UI" w:hAnsi="Segoe UI" w:cs="Segoe UI"/>
-        </w:rPr>
-      </w:pPr>
-      <w:r>
-        <w:rPr>
-          <w:rFonts w:ascii="Segoe UI" w:hAnsi="Segoe UI" w:cs="Segoe UI"/>
+          <w:sz w:val="24"/>
+          <w:szCs w:val="24"/>
+        </w:rPr>
+      </w:pPr>
+      <w:r>
+        <w:rPr>
+          <w:rFonts w:ascii="Segoe UI" w:hAnsi="Segoe UI" w:cs="Segoe UI"/>
+          <w:sz w:val="24"/>
+          <w:szCs w:val="24"/>
         </w:rPr>
         <w:t>Haryana State Electronics, Development Corporation (</w:t>
       </w:r>
@@ -574,12 +683,16 @@
         <w:rPr>
           <w:rFonts w:ascii="Segoe UI" w:hAnsi="Segoe UI" w:cs="Segoe UI"/>
           <w:b/>
+          <w:sz w:val="24"/>
+          <w:szCs w:val="24"/>
         </w:rPr>
         <w:t>HARTRON</w:t>
       </w:r>
       <w:r>
         <w:rPr>
           <w:rFonts w:ascii="Segoe UI" w:hAnsi="Segoe UI" w:cs="Segoe UI"/>
+          <w:sz w:val="24"/>
+          <w:szCs w:val="24"/>
         </w:rPr>
         <w:t>)</w:t>
       </w:r>
@@ -591,11 +704,15 @@
         <w:jc w:val="both"/>
         <w:rPr>
           <w:rFonts w:ascii="Segoe UI" w:hAnsi="Segoe UI" w:cs="Segoe UI"/>
-        </w:rPr>
-      </w:pPr>
-      <w:r>
-        <w:rPr>
-          <w:rFonts w:ascii="Segoe UI" w:hAnsi="Segoe UI" w:cs="Segoe UI"/>
+          <w:sz w:val="24"/>
+          <w:szCs w:val="24"/>
+        </w:rPr>
+      </w:pPr>
+      <w:r>
+        <w:rPr>
+          <w:rFonts w:ascii="Segoe UI" w:hAnsi="Segoe UI" w:cs="Segoe UI"/>
+          <w:sz w:val="24"/>
+          <w:szCs w:val="24"/>
         </w:rPr>
         <w:t>SCO No. 111-13, Sector-17B, Chandigarh.</w:t>
       </w:r>
@@ -607,11 +724,15 @@
         <w:jc w:val="both"/>
         <w:rPr>
           <w:rFonts w:ascii="Segoe UI" w:hAnsi="Segoe UI" w:cs="Segoe UI"/>
-        </w:rPr>
-      </w:pPr>
-      <w:r>
-        <w:rPr>
-          <w:rFonts w:ascii="Segoe UI" w:hAnsi="Segoe UI" w:cs="Segoe UI"/>
+          <w:sz w:val="24"/>
+          <w:szCs w:val="24"/>
+        </w:rPr>
+      </w:pPr>
+      <w:r>
+        <w:rPr>
+          <w:rFonts w:ascii="Segoe UI" w:hAnsi="Segoe UI" w:cs="Segoe UI"/>
+          <w:sz w:val="24"/>
+          <w:szCs w:val="24"/>
         </w:rPr>
         <w:t xml:space="preserve">Email: </w:t>
       </w:r>
@@ -620,6 +741,8 @@
           <w:rPr>
             <w:rStyle w:val="Hyperlink"/>
             <w:rFonts w:ascii="Segoe UI" w:hAnsi="Segoe UI" w:cs="Segoe UI"/>
+            <w:sz w:val="24"/>
+            <w:szCs w:val="24"/>
           </w:rPr>
           <w:t>mdhartron@gmail.com</w:t>
         </w:r>
@@ -631,26 +754,34 @@
         <w:jc w:val="both"/>
         <w:rPr>
           <w:rFonts w:ascii="Segoe UI" w:hAnsi="Segoe UI" w:cs="Segoe UI"/>
-        </w:rPr>
-      </w:pPr>
-    </w:p>
-    <w:p>
-      <w:pPr>
-        <w:spacing w:after="0" w:line="240" w:lineRule="auto"/>
-        <w:jc w:val="both"/>
-        <w:rPr>
-          <w:rFonts w:ascii="Segoe UI" w:hAnsi="Segoe UI" w:cs="Segoe UI"/>
-        </w:rPr>
-      </w:pPr>
-      <w:r>
-        <w:rPr>
-          <w:rFonts w:ascii="Segoe UI" w:hAnsi="Segoe UI" w:cs="Segoe UI"/>
-        </w:rPr>
-        <w:tab/>
-      </w:r>
-      <w:r>
-        <w:rPr>
-          <w:rFonts w:ascii="Segoe UI" w:hAnsi="Segoe UI" w:cs="Segoe UI"/>
+          <w:sz w:val="24"/>
+          <w:szCs w:val="24"/>
+        </w:rPr>
+      </w:pPr>
+    </w:p>
+    <w:p>
+      <w:pPr>
+        <w:spacing w:after="0" w:line="240" w:lineRule="auto"/>
+        <w:jc w:val="both"/>
+        <w:rPr>
+          <w:rFonts w:ascii="Segoe UI" w:hAnsi="Segoe UI" w:cs="Segoe UI"/>
+          <w:sz w:val="24"/>
+          <w:szCs w:val="24"/>
+        </w:rPr>
+      </w:pPr>
+      <w:r>
+        <w:rPr>
+          <w:rFonts w:ascii="Segoe UI" w:hAnsi="Segoe UI" w:cs="Segoe UI"/>
+          <w:sz w:val="24"/>
+          <w:szCs w:val="24"/>
+        </w:rPr>
+        <w:tab/>
+      </w:r>
+      <w:r>
+        <w:rPr>
+          <w:rFonts w:ascii="Segoe UI" w:hAnsi="Segoe UI" w:cs="Segoe UI"/>
+          <w:sz w:val="24"/>
+          <w:szCs w:val="24"/>
         </w:rPr>
         <w:tab/>
       </w:r>
@@ -658,6 +789,8 @@
       <w:r>
         <w:rPr>
           <w:rFonts w:ascii="Segoe UI" w:hAnsi="Segoe UI" w:cs="Segoe UI"/>
+          <w:sz w:val="24"/>
+          <w:szCs w:val="24"/>
         </w:rPr>
         <w:t>Memo.</w:t>
       </w:r>
@@ -665,6 +798,8 @@
       <w:r>
         <w:rPr>
           <w:rFonts w:ascii="Segoe UI" w:hAnsi="Segoe UI" w:cs="Segoe UI"/>
+          <w:sz w:val="24"/>
+          <w:szCs w:val="24"/>
         </w:rPr>
         <w:t xml:space="preserve"> No. {{FILE_NUMBER}}</w:t>
       </w:r>
@@ -675,17 +810,23 @@
         <w:jc w:val="both"/>
         <w:rPr>
           <w:rFonts w:ascii="Segoe UI" w:hAnsi="Segoe UI" w:cs="Segoe UI"/>
-        </w:rPr>
-      </w:pPr>
-      <w:r>
-        <w:rPr>
-          <w:rFonts w:ascii="Segoe UI" w:hAnsi="Segoe UI" w:cs="Segoe UI"/>
-        </w:rPr>
-        <w:tab/>
-      </w:r>
-      <w:r>
-        <w:rPr>
-          <w:rFonts w:ascii="Segoe UI" w:hAnsi="Segoe UI" w:cs="Segoe UI"/>
+          <w:sz w:val="24"/>
+          <w:szCs w:val="24"/>
+        </w:rPr>
+      </w:pPr>
+      <w:r>
+        <w:rPr>
+          <w:rFonts w:ascii="Segoe UI" w:hAnsi="Segoe UI" w:cs="Segoe UI"/>
+          <w:sz w:val="24"/>
+          <w:szCs w:val="24"/>
+        </w:rPr>
+        <w:tab/>
+      </w:r>
+      <w:r>
+        <w:rPr>
+          <w:rFonts w:ascii="Segoe UI" w:hAnsi="Segoe UI" w:cs="Segoe UI"/>
+          <w:sz w:val="24"/>
+          <w:szCs w:val="24"/>
         </w:rPr>
         <w:tab/>
         <w:t>Dated Chandigarh, the {{BRANCH</w:t>
@@ -693,6 +834,8 @@
       <w:r>
         <w:rPr>
           <w:rFonts w:ascii="Segoe UI" w:hAnsi="Segoe UI" w:cs="Segoe UI"/>
+          <w:sz w:val="24"/>
+          <w:szCs w:val="24"/>
         </w:rPr>
         <w:t>_CFMS_DATE}}</w:t>
       </w:r>
@@ -703,6 +846,8 @@
         <w:jc w:val="both"/>
         <w:rPr>
           <w:rFonts w:ascii="Segoe UI" w:hAnsi="Segoe UI" w:cs="Segoe UI"/>
+          <w:sz w:val="24"/>
+          <w:szCs w:val="24"/>
         </w:rPr>
       </w:pPr>
     </w:p>
@@ -714,12 +859,16 @@
         <w:rPr>
           <w:rFonts w:ascii="Segoe UI" w:hAnsi="Segoe UI" w:cs="Segoe UI"/>
           <w:b/>
+          <w:sz w:val="24"/>
+          <w:szCs w:val="24"/>
         </w:rPr>
       </w:pPr>
       <w:r>
         <w:rPr>
           <w:rFonts w:ascii="Segoe UI" w:hAnsi="Segoe UI" w:cs="Segoe UI"/>
           <w:b/>
+          <w:sz w:val="24"/>
+          <w:szCs w:val="24"/>
         </w:rPr>
         <w:t xml:space="preserve">Subject: </w:t>
       </w:r>
@@ -727,6 +876,8 @@
         <w:rPr>
           <w:rFonts w:ascii="Segoe UI" w:hAnsi="Segoe UI" w:cs="Segoe UI"/>
           <w:b/>
+          <w:sz w:val="24"/>
+          <w:szCs w:val="24"/>
         </w:rPr>
         <w:tab/>
         <w:t>{{PUC_SUBJECT}}</w:t>
@@ -738,41 +889,55 @@
         <w:jc w:val="both"/>
         <w:rPr>
           <w:rFonts w:ascii="Segoe UI" w:hAnsi="Segoe UI" w:cs="Segoe UI"/>
-        </w:rPr>
-      </w:pPr>
-      <w:r>
-        <w:rPr>
-          <w:rFonts w:ascii="Segoe UI" w:hAnsi="Segoe UI" w:cs="Segoe UI"/>
-        </w:rPr>
-        <w:tab/>
-      </w:r>
-      <w:r>
-        <w:rPr>
-          <w:rFonts w:ascii="Segoe UI" w:hAnsi="Segoe UI" w:cs="Segoe UI"/>
-        </w:rPr>
-        <w:tab/>
-      </w:r>
-      <w:r>
-        <w:rPr>
-          <w:rFonts w:ascii="Segoe UI" w:hAnsi="Segoe UI" w:cs="Segoe UI"/>
-        </w:rPr>
-        <w:tab/>
-      </w:r>
-      <w:r>
-        <w:rPr>
-          <w:rFonts w:ascii="Segoe UI" w:hAnsi="Segoe UI" w:cs="Segoe UI"/>
-        </w:rPr>
-        <w:tab/>
-      </w:r>
-      <w:r>
-        <w:rPr>
-          <w:rFonts w:ascii="Segoe UI" w:hAnsi="Segoe UI" w:cs="Segoe UI"/>
-        </w:rPr>
-        <w:tab/>
-      </w:r>
-      <w:r>
-        <w:rPr>
-          <w:rFonts w:ascii="Segoe UI" w:hAnsi="Segoe UI" w:cs="Segoe UI"/>
+          <w:sz w:val="24"/>
+          <w:szCs w:val="24"/>
+        </w:rPr>
+      </w:pPr>
+      <w:r>
+        <w:rPr>
+          <w:rFonts w:ascii="Segoe UI" w:hAnsi="Segoe UI" w:cs="Segoe UI"/>
+          <w:sz w:val="24"/>
+          <w:szCs w:val="24"/>
+        </w:rPr>
+        <w:tab/>
+      </w:r>
+      <w:r>
+        <w:rPr>
+          <w:rFonts w:ascii="Segoe UI" w:hAnsi="Segoe UI" w:cs="Segoe UI"/>
+          <w:sz w:val="24"/>
+          <w:szCs w:val="24"/>
+        </w:rPr>
+        <w:tab/>
+      </w:r>
+      <w:r>
+        <w:rPr>
+          <w:rFonts w:ascii="Segoe UI" w:hAnsi="Segoe UI" w:cs="Segoe UI"/>
+          <w:sz w:val="24"/>
+          <w:szCs w:val="24"/>
+        </w:rPr>
+        <w:tab/>
+      </w:r>
+      <w:r>
+        <w:rPr>
+          <w:rFonts w:ascii="Segoe UI" w:hAnsi="Segoe UI" w:cs="Segoe UI"/>
+          <w:sz w:val="24"/>
+          <w:szCs w:val="24"/>
+        </w:rPr>
+        <w:tab/>
+      </w:r>
+      <w:r>
+        <w:rPr>
+          <w:rFonts w:ascii="Segoe UI" w:hAnsi="Segoe UI" w:cs="Segoe UI"/>
+          <w:sz w:val="24"/>
+          <w:szCs w:val="24"/>
+        </w:rPr>
+        <w:tab/>
+      </w:r>
+      <w:r>
+        <w:rPr>
+          <w:rFonts w:ascii="Segoe UI" w:hAnsi="Segoe UI" w:cs="Segoe UI"/>
+          <w:sz w:val="24"/>
+          <w:szCs w:val="24"/>
         </w:rPr>
         <w:tab/>
         <w:t>*****</w:t>
@@ -784,186 +949,189 @@
         <w:jc w:val="both"/>
         <w:rPr>
           <w:rFonts w:ascii="Segoe UI" w:hAnsi="Segoe UI" w:cs="Segoe UI"/>
-        </w:rPr>
-      </w:pPr>
-      <w:r>
-        <w:rPr>
-          <w:rFonts w:ascii="Segoe UI" w:hAnsi="Segoe UI" w:cs="Segoe UI"/>
-        </w:rPr>
-        <w:tab/>
-      </w:r>
-      <w:r>
-        <w:rPr>
-          <w:rFonts w:ascii="Segoe UI" w:hAnsi="Segoe UI" w:cs="Segoe UI"/>
-        </w:rPr>
-        <w:tab/>
-        <w:t xml:space="preserve">Reference to the </w:t>
-      </w:r>
-      <w:r>
-        <w:rPr>
-          <w:rFonts w:ascii="Segoe UI" w:hAnsi="Segoe UI" w:cs="Segoe UI"/>
-        </w:rPr>
-        <w:t>subject cited above.</w:t>
-      </w:r>
-    </w:p>
-    <w:p>
-      <w:pPr>
-        <w:spacing w:line="240" w:lineRule="auto"/>
-        <w:jc w:val="both"/>
-        <w:rPr>
-          <w:rFonts w:ascii="Segoe UI" w:hAnsi="Segoe UI" w:cs="Segoe UI"/>
-        </w:rPr>
-      </w:pPr>
-    </w:p>
-    <w:p>
-      <w:pPr>
-        <w:spacing w:line="240" w:lineRule="auto"/>
-        <w:jc w:val="both"/>
-        <w:rPr>
-          <w:rFonts w:ascii="Segoe UI" w:hAnsi="Segoe UI" w:cs="Segoe UI"/>
-        </w:rPr>
-      </w:pPr>
-      <w:r>
-        <w:rPr>
-          <w:rFonts w:ascii="Segoe UI" w:hAnsi="Segoe UI" w:cs="Segoe UI"/>
+          <w:sz w:val="24"/>
+          <w:szCs w:val="24"/>
+        </w:rPr>
+      </w:pPr>
+      <w:r>
+        <w:rPr>
+          <w:rFonts w:ascii="Segoe UI" w:hAnsi="Segoe UI" w:cs="Segoe UI"/>
+          <w:sz w:val="24"/>
+          <w:szCs w:val="24"/>
+        </w:rPr>
+        <w:tab/>
+      </w:r>
+      <w:r>
+        <w:rPr>
+          <w:rFonts w:ascii="Segoe UI" w:hAnsi="Segoe UI" w:cs="Segoe UI"/>
+          <w:sz w:val="24"/>
+          <w:szCs w:val="24"/>
+        </w:rPr>
+        <w:tab/>
+        <w:t>Reference to the subject cited above.</w:t>
+      </w:r>
+    </w:p>
+    <w:p>
+      <w:pPr>
+        <w:spacing w:line="360" w:lineRule="auto"/>
+        <w:jc w:val="both"/>
+        <w:rPr>
+          <w:rFonts w:ascii="Segoe UI" w:hAnsi="Segoe UI" w:cs="Segoe UI"/>
+          <w:sz w:val="24"/>
+          <w:szCs w:val="24"/>
+        </w:rPr>
+      </w:pPr>
+      <w:r>
+        <w:rPr>
+          <w:rFonts w:ascii="Segoe UI" w:hAnsi="Segoe UI" w:cs="Segoe UI"/>
+          <w:sz w:val="24"/>
+          <w:szCs w:val="24"/>
         </w:rPr>
         <w:t>2.</w:t>
       </w:r>
       <w:r>
         <w:rPr>
           <w:rFonts w:ascii="Segoe UI" w:hAnsi="Segoe UI" w:cs="Segoe UI"/>
-        </w:rPr>
-        <w:tab/>
-      </w:r>
-      <w:r>
-        <w:rPr>
-          <w:rFonts w:ascii="Segoe UI" w:hAnsi="Segoe UI" w:cs="Segoe UI"/>
-        </w:rPr>
-        <w:tab/>
-      </w:r>
-      <w:r>
-        <w:rPr>
-          <w:rFonts w:ascii="Segoe UI" w:hAnsi="Segoe UI" w:cs="Segoe UI"/>
-        </w:rPr>
-        <w:t>I have been directed to send a copy of letter no. {{PUC_NUMBER}} dated {{PUC_DATE}} received from {{PUC_SENDER}} for further necessary action and send the requisite information directly to the concerned under the intimati</w:t>
-      </w:r>
-      <w:r>
-        <w:rPr>
-          <w:rFonts w:ascii="Segoe UI" w:hAnsi="Segoe UI" w:cs="Segoe UI"/>
-        </w:rPr>
-        <w:t>on to this office</w:t>
-      </w:r>
-      <w:r>
-        <w:rPr>
-          <w:rFonts w:ascii="Segoe UI" w:hAnsi="Segoe UI" w:cs="Segoe UI"/>
+          <w:sz w:val="24"/>
+          <w:szCs w:val="24"/>
+        </w:rPr>
+        <w:tab/>
+      </w:r>
+      <w:r>
+        <w:rPr>
+          <w:rFonts w:ascii="Segoe UI" w:hAnsi="Segoe UI" w:cs="Segoe UI"/>
+          <w:sz w:val="24"/>
+          <w:szCs w:val="24"/>
+        </w:rPr>
+        <w:tab/>
+      </w:r>
+      <w:r>
+        <w:rPr>
+          <w:rFonts w:ascii="Segoe UI" w:hAnsi="Segoe UI" w:cs="Segoe UI"/>
+          <w:sz w:val="24"/>
+          <w:szCs w:val="24"/>
+        </w:rPr>
+        <w:t>I have been directed to send a copy of letter no. {{PUC_NUMBER}} dated {{PUC_DATE}} received from {{PUC_SENDER}} for further necessary action and send the requisite information directly to the concerned under the intimation to this office</w:t>
+      </w:r>
+      <w:r>
+        <w:rPr>
+          <w:rFonts w:ascii="Segoe UI" w:hAnsi="Segoe UI" w:cs="Segoe UI"/>
+          <w:sz w:val="24"/>
+          <w:szCs w:val="24"/>
         </w:rPr>
         <w:t>.</w:t>
       </w:r>
     </w:p>
     <w:p>
       <w:pPr>
-        <w:spacing w:line="240" w:lineRule="auto"/>
-        <w:jc w:val="both"/>
-        <w:rPr>
-          <w:rFonts w:ascii="Segoe UI" w:hAnsi="Segoe UI" w:cs="Segoe UI"/>
-        </w:rPr>
-      </w:pPr>
-    </w:p>
-    <w:p>
-      <w:pPr>
-        <w:spacing w:after="0" w:line="240" w:lineRule="auto"/>
-        <w:jc w:val="both"/>
-        <w:rPr>
-          <w:rFonts w:ascii="Segoe UI" w:hAnsi="Segoe UI" w:cs="Segoe UI"/>
-        </w:rPr>
-      </w:pPr>
-    </w:p>
-    <w:p>
-      <w:pPr>
-        <w:spacing w:after="0" w:line="240" w:lineRule="auto"/>
-        <w:jc w:val="both"/>
-        <w:rPr>
-          <w:rFonts w:ascii="Segoe UI" w:hAnsi="Segoe UI" w:cs="Segoe UI"/>
-        </w:rPr>
-      </w:pPr>
-      <w:r>
-        <w:rPr>
-          <w:rFonts w:ascii="Segoe UI" w:hAnsi="Segoe UI" w:cs="Segoe UI"/>
-        </w:rPr>
-        <w:tab/>
-      </w:r>
-      <w:r>
-        <w:rPr>
-          <w:rFonts w:ascii="Segoe UI" w:hAnsi="Segoe UI" w:cs="Segoe UI"/>
-        </w:rPr>
-        <w:tab/>
-      </w:r>
-      <w:r>
-        <w:rPr>
-          <w:rFonts w:ascii="Segoe UI" w:hAnsi="Segoe UI" w:cs="Segoe UI"/>
-        </w:rPr>
-        <w:tab/>
-      </w:r>
-      <w:r>
-        <w:rPr>
-          <w:rFonts w:ascii="Segoe UI" w:hAnsi="Segoe UI" w:cs="Segoe UI"/>
-        </w:rPr>
-        <w:tab/>
-      </w:r>
-      <w:r>
-        <w:rPr>
-          <w:rFonts w:ascii="Segoe UI" w:hAnsi="Segoe UI" w:cs="Segoe UI"/>
-        </w:rPr>
-        <w:tab/>
-      </w:r>
-      <w:r>
-        <w:rPr>
-          <w:rFonts w:ascii="Segoe UI" w:hAnsi="Segoe UI" w:cs="Segoe UI"/>
-        </w:rPr>
-        <w:tab/>
-      </w:r>
-      <w:r>
-        <w:rPr>
-          <w:rFonts w:ascii="Segoe UI" w:hAnsi="Segoe UI" w:cs="Segoe UI"/>
-        </w:rPr>
-        <w:tab/>
-      </w:r>
-      <w:r>
-        <w:rPr>
-          <w:rFonts w:ascii="Segoe UI" w:hAnsi="Segoe UI" w:cs="Segoe UI"/>
-        </w:rPr>
-        <w:t xml:space="preserve"> </w:t>
-      </w:r>
-      <w:r>
-        <w:rPr>
-          <w:rFonts w:ascii="Segoe UI" w:hAnsi="Segoe UI" w:cs="Segoe UI"/>
-        </w:rPr>
-        <w:t>Superintendent Industries-II,</w:t>
-      </w:r>
-    </w:p>
-    <w:p>
-      <w:pPr>
-        <w:spacing w:after="0" w:line="240" w:lineRule="auto"/>
-        <w:jc w:val="both"/>
-        <w:rPr>
-          <w:rFonts w:ascii="Segoe UI" w:hAnsi="Segoe UI" w:cs="Segoe UI"/>
-        </w:rPr>
-      </w:pPr>
-      <w:r>
-        <w:rPr>
-          <w:rFonts w:ascii="Segoe UI" w:hAnsi="Segoe UI" w:cs="Segoe UI"/>
-        </w:rPr>
-        <w:tab/>
-      </w:r>
-      <w:r>
-        <w:rPr>
-          <w:rFonts w:ascii="Segoe UI" w:hAnsi="Segoe UI" w:cs="Segoe UI"/>
-        </w:rPr>
-        <w:tab/>
-      </w:r>
-      <w:r>
-        <w:rPr>
-          <w:rFonts w:ascii="Segoe UI" w:hAnsi="Segoe UI" w:cs="Segoe UI"/>
+        <w:spacing w:after="0" w:line="240" w:lineRule="auto"/>
+        <w:jc w:val="both"/>
+        <w:rPr>
+          <w:rFonts w:ascii="Segoe UI" w:hAnsi="Segoe UI" w:cs="Segoe UI"/>
+          <w:sz w:val="24"/>
+          <w:szCs w:val="24"/>
+        </w:rPr>
+      </w:pPr>
+    </w:p>
+    <w:p>
+      <w:pPr>
+        <w:spacing w:after="0" w:line="240" w:lineRule="auto"/>
+        <w:jc w:val="both"/>
+        <w:rPr>
+          <w:rFonts w:ascii="Segoe UI" w:hAnsi="Segoe UI" w:cs="Segoe UI"/>
+          <w:sz w:val="24"/>
+          <w:szCs w:val="24"/>
+        </w:rPr>
+      </w:pPr>
+      <w:r>
+        <w:rPr>
+          <w:rFonts w:ascii="Segoe UI" w:hAnsi="Segoe UI" w:cs="Segoe UI"/>
+          <w:sz w:val="24"/>
+          <w:szCs w:val="24"/>
+        </w:rPr>
+        <w:tab/>
+      </w:r>
+      <w:r>
+        <w:rPr>
+          <w:rFonts w:ascii="Segoe UI" w:hAnsi="Segoe UI" w:cs="Segoe UI"/>
+          <w:sz w:val="24"/>
+          <w:szCs w:val="24"/>
+        </w:rPr>
+        <w:tab/>
+      </w:r>
+      <w:r>
+        <w:rPr>
+          <w:rFonts w:ascii="Segoe UI" w:hAnsi="Segoe UI" w:cs="Segoe UI"/>
+          <w:sz w:val="24"/>
+          <w:szCs w:val="24"/>
+        </w:rPr>
+        <w:tab/>
+      </w:r>
+      <w:r>
+        <w:rPr>
+          <w:rFonts w:ascii="Segoe UI" w:hAnsi="Segoe UI" w:cs="Segoe UI"/>
+          <w:sz w:val="24"/>
+          <w:szCs w:val="24"/>
+        </w:rPr>
+        <w:tab/>
+      </w:r>
+      <w:r>
+        <w:rPr>
+          <w:rFonts w:ascii="Segoe UI" w:hAnsi="Segoe UI" w:cs="Segoe UI"/>
+          <w:sz w:val="24"/>
+          <w:szCs w:val="24"/>
+        </w:rPr>
+        <w:tab/>
+      </w:r>
+      <w:r>
+        <w:rPr>
+          <w:rFonts w:ascii="Segoe UI" w:hAnsi="Segoe UI" w:cs="Segoe UI"/>
+          <w:sz w:val="24"/>
+          <w:szCs w:val="24"/>
+        </w:rPr>
+        <w:tab/>
+      </w:r>
+      <w:r>
+        <w:rPr>
+          <w:rFonts w:ascii="Segoe UI" w:hAnsi="Segoe UI" w:cs="Segoe UI"/>
+          <w:sz w:val="24"/>
+          <w:szCs w:val="24"/>
+        </w:rPr>
+        <w:tab/>
+        <w:t xml:space="preserve"> Superintendent Industries-II,</w:t>
+      </w:r>
+    </w:p>
+    <w:p>
+      <w:pPr>
+        <w:spacing w:after="0" w:line="240" w:lineRule="auto"/>
+        <w:jc w:val="both"/>
+        <w:rPr>
+          <w:rFonts w:ascii="Segoe UI" w:hAnsi="Segoe UI" w:cs="Segoe UI"/>
+          <w:sz w:val="24"/>
+          <w:szCs w:val="24"/>
+        </w:rPr>
+      </w:pPr>
+      <w:r>
+        <w:rPr>
+          <w:rFonts w:ascii="Segoe UI" w:hAnsi="Segoe UI" w:cs="Segoe UI"/>
+          <w:sz w:val="24"/>
+          <w:szCs w:val="24"/>
+        </w:rPr>
+        <w:tab/>
+      </w:r>
+      <w:r>
+        <w:rPr>
+          <w:rFonts w:ascii="Segoe UI" w:hAnsi="Segoe UI" w:cs="Segoe UI"/>
+          <w:sz w:val="24"/>
+          <w:szCs w:val="24"/>
+        </w:rPr>
+        <w:tab/>
+      </w:r>
+      <w:r>
+        <w:rPr>
+          <w:rFonts w:ascii="Segoe UI" w:hAnsi="Segoe UI" w:cs="Segoe UI"/>
+          <w:sz w:val="24"/>
+          <w:szCs w:val="24"/>
         </w:rPr>
         <w:tab/>
         <w:t xml:space="preserve">                    </w:t>
@@ -971,13 +1139,19 @@
       <w:r>
         <w:rPr>
           <w:rFonts w:ascii="Segoe UI" w:hAnsi="Segoe UI" w:cs="Segoe UI"/>
-        </w:rPr>
-        <w:t xml:space="preserve">                  </w:t>
+          <w:sz w:val="24"/>
+          <w:szCs w:val="24"/>
+        </w:rPr>
+        <w:t xml:space="preserve">        </w:t>
       </w:r>
       <w:proofErr w:type="gramStart"/>
       <w:r>
         <w:rPr>
           <w:rFonts w:ascii="Segoe UI" w:hAnsi="Segoe UI" w:cs="Segoe UI"/>
+          <w:i/>
+          <w:iCs/>
+          <w:sz w:val="24"/>
+          <w:szCs w:val="24"/>
         </w:rPr>
         <w:t>for</w:t>
       </w:r>
@@ -985,6 +1159,8 @@
       <w:r>
         <w:rPr>
           <w:rFonts w:ascii="Segoe UI" w:hAnsi="Segoe UI" w:cs="Segoe UI"/>
+          <w:sz w:val="24"/>
+          <w:szCs w:val="24"/>
         </w:rPr>
         <w:t xml:space="preserve"> Commissioner &amp; Secretary to </w:t>
       </w:r>
@@ -992,6 +1168,8 @@
       <w:r>
         <w:rPr>
           <w:rFonts w:ascii="Segoe UI" w:hAnsi="Segoe UI" w:cs="Segoe UI"/>
+          <w:sz w:val="24"/>
+          <w:szCs w:val="24"/>
         </w:rPr>
         <w:t>Govt.of</w:t>
       </w:r>
@@ -999,6 +1177,8 @@
       <w:r>
         <w:rPr>
           <w:rFonts w:ascii="Segoe UI" w:hAnsi="Segoe UI" w:cs="Segoe UI"/>
+          <w:sz w:val="24"/>
+          <w:szCs w:val="24"/>
         </w:rPr>
         <w:t xml:space="preserve">  Haryana,</w:t>
       </w:r>
@@ -1009,55 +1189,65 @@
         <w:jc w:val="both"/>
         <w:rPr>
           <w:rFonts w:ascii="Segoe UI" w:hAnsi="Segoe UI" w:cs="Segoe UI"/>
-        </w:rPr>
-      </w:pPr>
-      <w:r>
-        <w:rPr>
-          <w:rFonts w:ascii="Segoe UI" w:hAnsi="Segoe UI" w:cs="Segoe UI"/>
-        </w:rPr>
-        <w:tab/>
-      </w:r>
-      <w:r>
-        <w:rPr>
-          <w:rFonts w:ascii="Segoe UI" w:hAnsi="Segoe UI" w:cs="Segoe UI"/>
-        </w:rPr>
-        <w:tab/>
-      </w:r>
-      <w:r>
-        <w:rPr>
-          <w:rFonts w:ascii="Segoe UI" w:hAnsi="Segoe UI" w:cs="Segoe UI"/>
-        </w:rPr>
-        <w:tab/>
-      </w:r>
-      <w:r>
-        <w:rPr>
-          <w:rFonts w:ascii="Segoe UI" w:hAnsi="Segoe UI" w:cs="Segoe UI"/>
-        </w:rPr>
-        <w:tab/>
-      </w:r>
-      <w:r>
-        <w:rPr>
-          <w:rFonts w:ascii="Segoe UI" w:hAnsi="Segoe UI" w:cs="Segoe UI"/>
-        </w:rPr>
-        <w:tab/>
-      </w:r>
-      <w:r>
-        <w:rPr>
-          <w:rFonts w:ascii="Segoe UI" w:hAnsi="Segoe UI" w:cs="Segoe UI"/>
-        </w:rPr>
-        <w:tab/>
-        <w:t xml:space="preserve">  </w:t>
-      </w:r>
-      <w:r>
-        <w:rPr>
-          <w:rFonts w:ascii="Segoe UI" w:hAnsi="Segoe UI" w:cs="Segoe UI"/>
-        </w:rPr>
-        <w:t xml:space="preserve">           </w:t>
+          <w:sz w:val="24"/>
+          <w:szCs w:val="24"/>
+        </w:rPr>
+      </w:pPr>
+      <w:r>
+        <w:rPr>
+          <w:rFonts w:ascii="Segoe UI" w:hAnsi="Segoe UI" w:cs="Segoe UI"/>
+          <w:sz w:val="24"/>
+          <w:szCs w:val="24"/>
+        </w:rPr>
+        <w:tab/>
+      </w:r>
+      <w:r>
+        <w:rPr>
+          <w:rFonts w:ascii="Segoe UI" w:hAnsi="Segoe UI" w:cs="Segoe UI"/>
+          <w:sz w:val="24"/>
+          <w:szCs w:val="24"/>
+        </w:rPr>
+        <w:tab/>
+      </w:r>
+      <w:r>
+        <w:rPr>
+          <w:rFonts w:ascii="Segoe UI" w:hAnsi="Segoe UI" w:cs="Segoe UI"/>
+          <w:sz w:val="24"/>
+          <w:szCs w:val="24"/>
+        </w:rPr>
+        <w:tab/>
+      </w:r>
+      <w:r>
+        <w:rPr>
+          <w:rFonts w:ascii="Segoe UI" w:hAnsi="Segoe UI" w:cs="Segoe UI"/>
+          <w:sz w:val="24"/>
+          <w:szCs w:val="24"/>
+        </w:rPr>
+        <w:tab/>
+      </w:r>
+      <w:r>
+        <w:rPr>
+          <w:rFonts w:ascii="Segoe UI" w:hAnsi="Segoe UI" w:cs="Segoe UI"/>
+          <w:sz w:val="24"/>
+          <w:szCs w:val="24"/>
+        </w:rPr>
+        <w:tab/>
+      </w:r>
+      <w:r>
+        <w:rPr>
+          <w:rFonts w:ascii="Segoe UI" w:hAnsi="Segoe UI" w:cs="Segoe UI"/>
+          <w:sz w:val="24"/>
+          <w:szCs w:val="24"/>
+        </w:rPr>
+        <w:tab/>
+        <w:t xml:space="preserve">             </w:t>
       </w:r>
       <w:proofErr w:type="gramStart"/>
       <w:r>
         <w:rPr>
           <w:rFonts w:ascii="Segoe UI" w:hAnsi="Segoe UI" w:cs="Segoe UI"/>
+          <w:sz w:val="24"/>
+          <w:szCs w:val="24"/>
         </w:rPr>
         <w:t>Industries &amp; Commerce Department.</w:t>
       </w:r>
@@ -1069,16 +1259,19 @@
         <w:jc w:val="both"/>
         <w:rPr>
           <w:rFonts w:ascii="Segoe UI" w:hAnsi="Segoe UI" w:cs="Segoe UI"/>
-          <w:sz w:val="10"/>
-        </w:rPr>
-      </w:pPr>
-    </w:p>
-    <w:p>
-      <w:pPr>
-        <w:spacing w:after="0" w:line="240" w:lineRule="auto"/>
-        <w:jc w:val="both"/>
-        <w:rPr>
-          <w:rFonts w:ascii="Segoe UI" w:hAnsi="Segoe UI" w:cs="Segoe UI"/>
+          <w:sz w:val="24"/>
+          <w:szCs w:val="24"/>
+        </w:rPr>
+      </w:pPr>
+    </w:p>
+    <w:p>
+      <w:pPr>
+        <w:spacing w:after="0" w:line="240" w:lineRule="auto"/>
+        <w:jc w:val="both"/>
+        <w:rPr>
+          <w:rFonts w:ascii="Segoe UI" w:hAnsi="Segoe UI" w:cs="Segoe UI"/>
+          <w:sz w:val="24"/>
+          <w:szCs w:val="24"/>
         </w:rPr>
       </w:pPr>
       <w:proofErr w:type="spellStart"/>
@@ -1086,6 +1279,8 @@
       <w:r>
         <w:rPr>
           <w:rFonts w:ascii="Segoe UI" w:hAnsi="Segoe UI" w:cs="Segoe UI"/>
+          <w:sz w:val="24"/>
+          <w:szCs w:val="24"/>
         </w:rPr>
         <w:t>Endst</w:t>
       </w:r>
@@ -1093,6 +1288,8 @@
       <w:r>
         <w:rPr>
           <w:rFonts w:ascii="Segoe UI" w:hAnsi="Segoe UI" w:cs="Segoe UI"/>
+          <w:sz w:val="24"/>
+          <w:szCs w:val="24"/>
         </w:rPr>
         <w:t>.</w:t>
       </w:r>
@@ -1100,42 +1297,40 @@
       <w:r>
         <w:rPr>
           <w:rFonts w:ascii="Segoe UI" w:hAnsi="Segoe UI" w:cs="Segoe UI"/>
+          <w:sz w:val="24"/>
+          <w:szCs w:val="24"/>
         </w:rPr>
         <w:t xml:space="preserve"> No.</w:t>
       </w:r>
       <w:r>
         <w:rPr>
           <w:rFonts w:ascii="Segoe UI" w:hAnsi="Segoe UI" w:cs="Segoe UI"/>
+          <w:sz w:val="24"/>
+          <w:szCs w:val="24"/>
         </w:rPr>
         <w:t xml:space="preserve"> </w:t>
       </w:r>
       <w:r>
         <w:rPr>
           <w:rFonts w:ascii="Segoe UI" w:hAnsi="Segoe UI" w:cs="Segoe UI"/>
-        </w:rPr>
-        <w:t>{{FILE_NUMBER}}</w:t>
-      </w:r>
-      <w:r>
-        <w:rPr>
-          <w:rFonts w:ascii="Segoe UI" w:hAnsi="Segoe UI" w:cs="Segoe UI"/>
-        </w:rPr>
-        <w:tab/>
-      </w:r>
-      <w:r>
-        <w:rPr>
-          <w:rFonts w:ascii="Segoe UI" w:hAnsi="Segoe UI" w:cs="Segoe UI"/>
-        </w:rPr>
-        <w:tab/>
-      </w:r>
-      <w:r>
-        <w:rPr>
-          <w:rFonts w:ascii="Segoe UI" w:hAnsi="Segoe UI" w:cs="Segoe UI"/>
-        </w:rPr>
-        <w:t xml:space="preserve">                  Dated Chandigarh, the {{BRANCH</w:t>
-      </w:r>
-      <w:r>
-        <w:rPr>
-          <w:rFonts w:ascii="Segoe UI" w:hAnsi="Segoe UI" w:cs="Segoe UI"/>
+          <w:sz w:val="24"/>
+          <w:szCs w:val="24"/>
+        </w:rPr>
+        <w:t xml:space="preserve">{{FILE_NUMBER}}                     </w:t>
+      </w:r>
+      <w:r>
+        <w:rPr>
+          <w:rFonts w:ascii="Segoe UI" w:hAnsi="Segoe UI" w:cs="Segoe UI"/>
+          <w:sz w:val="24"/>
+          <w:szCs w:val="24"/>
+        </w:rPr>
+        <w:t>Dated Chandigarh, the {{BRANCH</w:t>
+      </w:r>
+      <w:r>
+        <w:rPr>
+          <w:rFonts w:ascii="Segoe UI" w:hAnsi="Segoe UI" w:cs="Segoe UI"/>
+          <w:sz w:val="24"/>
+          <w:szCs w:val="24"/>
         </w:rPr>
         <w:t>_CFMS_DATE}}</w:t>
       </w:r>
@@ -1146,7 +1341,8 @@
         <w:jc w:val="both"/>
         <w:rPr>
           <w:rFonts w:ascii="Segoe UI" w:hAnsi="Segoe UI" w:cs="Segoe UI"/>
-          <w:sz w:val="14"/>
+          <w:sz w:val="24"/>
+          <w:szCs w:val="24"/>
         </w:rPr>
       </w:pPr>
     </w:p>
@@ -1157,11 +1353,15 @@
         <w:jc w:val="both"/>
         <w:rPr>
           <w:rFonts w:ascii="Segoe UI" w:hAnsi="Segoe UI" w:cs="Segoe UI"/>
-        </w:rPr>
-      </w:pPr>
-      <w:r>
-        <w:rPr>
-          <w:rFonts w:ascii="Segoe UI" w:hAnsi="Segoe UI" w:cs="Segoe UI"/>
+          <w:sz w:val="24"/>
+          <w:szCs w:val="24"/>
+        </w:rPr>
+      </w:pPr>
+      <w:r>
+        <w:rPr>
+          <w:rFonts w:ascii="Segoe UI" w:hAnsi="Segoe UI" w:cs="Segoe UI"/>
+          <w:sz w:val="24"/>
+          <w:szCs w:val="24"/>
         </w:rPr>
         <w:tab/>
         <w:t xml:space="preserve">A copy is forwarded to the </w:t>
@@ -1169,6 +1369,8 @@
       <w:r>
         <w:rPr>
           <w:rFonts w:ascii="Segoe UI" w:hAnsi="Segoe UI" w:cs="Segoe UI"/>
+          <w:sz w:val="24"/>
+          <w:szCs w:val="24"/>
         </w:rPr>
         <w:t xml:space="preserve">{{PUC_SENDER}} </w:t>
       </w:r>
@@ -1176,6 +1378,8 @@
       <w:r>
         <w:rPr>
           <w:rFonts w:ascii="Segoe UI" w:hAnsi="Segoe UI" w:cs="Segoe UI"/>
+          <w:sz w:val="24"/>
+          <w:szCs w:val="24"/>
         </w:rPr>
         <w:t>w.r.t</w:t>
       </w:r>
@@ -1183,228 +1387,261 @@
       <w:r>
         <w:rPr>
           <w:rFonts w:ascii="Segoe UI" w:hAnsi="Segoe UI" w:cs="Segoe UI"/>
-        </w:rPr>
-        <w:t>. their letter no.</w:t>
-      </w:r>
-      <w:r>
-        <w:rPr>
-          <w:rFonts w:ascii="Segoe UI" w:hAnsi="Segoe UI" w:cs="Segoe UI"/>
+          <w:sz w:val="24"/>
+          <w:szCs w:val="24"/>
+        </w:rPr>
+        <w:t>. their letter no. {{PUC_NUMBER}</w:t>
+      </w:r>
+      <w:proofErr w:type="gramStart"/>
+      <w:r>
+        <w:rPr>
+          <w:rFonts w:ascii="Segoe UI" w:hAnsi="Segoe UI" w:cs="Segoe UI"/>
+          <w:sz w:val="24"/>
+          <w:szCs w:val="24"/>
+        </w:rPr>
+        <w:t xml:space="preserve">}  </w:t>
+      </w:r>
+      <w:r>
+        <w:rPr>
+          <w:rFonts w:ascii="Segoe UI" w:hAnsi="Segoe UI" w:cs="Segoe UI"/>
+          <w:sz w:val="24"/>
+          <w:szCs w:val="24"/>
+        </w:rPr>
+        <w:t>dated</w:t>
+      </w:r>
+      <w:proofErr w:type="gramEnd"/>
+      <w:r>
+        <w:rPr>
+          <w:rFonts w:ascii="Segoe UI" w:hAnsi="Segoe UI" w:cs="Segoe UI"/>
+          <w:sz w:val="24"/>
+          <w:szCs w:val="24"/>
         </w:rPr>
         <w:t xml:space="preserve"> </w:t>
       </w:r>
       <w:r>
         <w:rPr>
           <w:rFonts w:ascii="Segoe UI" w:hAnsi="Segoe UI" w:cs="Segoe UI"/>
-        </w:rPr>
-        <w:t>{{PUC_NUMBER}</w:t>
+          <w:sz w:val="24"/>
+          <w:szCs w:val="24"/>
+        </w:rPr>
+        <w:t>{{PUC_DATE}}</w:t>
+      </w:r>
+      <w:r>
+        <w:rPr>
+          <w:rFonts w:ascii="Segoe UI" w:hAnsi="Segoe UI" w:cs="Segoe UI"/>
+          <w:sz w:val="24"/>
+          <w:szCs w:val="24"/>
+        </w:rPr>
+        <w:t xml:space="preserve"> for information &amp; necessary action.</w:t>
+      </w:r>
+    </w:p>
+    <w:p>
+      <w:pPr>
+        <w:spacing w:after="0" w:line="240" w:lineRule="auto"/>
+        <w:ind w:firstLine="720"/>
+        <w:jc w:val="both"/>
+        <w:rPr>
+          <w:rFonts w:ascii="Segoe UI" w:hAnsi="Segoe UI" w:cs="Segoe UI"/>
+          <w:sz w:val="24"/>
+          <w:szCs w:val="24"/>
+        </w:rPr>
+      </w:pPr>
+    </w:p>
+    <w:p>
+      <w:pPr>
+        <w:spacing w:after="0" w:line="240" w:lineRule="auto"/>
+        <w:ind w:firstLine="720"/>
+        <w:jc w:val="both"/>
+        <w:rPr>
+          <w:rFonts w:ascii="Segoe UI" w:hAnsi="Segoe UI" w:cs="Segoe UI"/>
+          <w:sz w:val="24"/>
+          <w:szCs w:val="24"/>
+        </w:rPr>
+      </w:pPr>
+    </w:p>
+    <w:p>
+      <w:pPr>
+        <w:spacing w:after="0" w:line="240" w:lineRule="auto"/>
+        <w:ind w:left="4320" w:firstLine="720"/>
+        <w:jc w:val="both"/>
+        <w:rPr>
+          <w:rFonts w:ascii="Segoe UI" w:hAnsi="Segoe UI" w:cs="Segoe UI"/>
+          <w:sz w:val="24"/>
+          <w:szCs w:val="24"/>
+        </w:rPr>
+      </w:pPr>
+      <w:r>
+        <w:rPr>
+          <w:rFonts w:ascii="Segoe UI" w:hAnsi="Segoe UI" w:cs="Segoe UI"/>
+          <w:sz w:val="24"/>
+          <w:szCs w:val="24"/>
+        </w:rPr>
+        <w:t xml:space="preserve">       Superintendent Industries-II,</w:t>
+      </w:r>
+    </w:p>
+    <w:p>
+      <w:pPr>
+        <w:spacing w:after="0" w:line="240" w:lineRule="auto"/>
+        <w:jc w:val="both"/>
+        <w:rPr>
+          <w:rFonts w:ascii="Segoe UI" w:hAnsi="Segoe UI" w:cs="Segoe UI"/>
+          <w:sz w:val="24"/>
+          <w:szCs w:val="24"/>
+        </w:rPr>
+      </w:pPr>
+      <w:r>
+        <w:rPr>
+          <w:rFonts w:ascii="Segoe UI" w:hAnsi="Segoe UI" w:cs="Segoe UI"/>
+          <w:sz w:val="24"/>
+          <w:szCs w:val="24"/>
+        </w:rPr>
+        <w:tab/>
+      </w:r>
+      <w:r>
+        <w:rPr>
+          <w:rFonts w:ascii="Segoe UI" w:hAnsi="Segoe UI" w:cs="Segoe UI"/>
+          <w:sz w:val="24"/>
+          <w:szCs w:val="24"/>
+        </w:rPr>
+        <w:tab/>
+      </w:r>
+      <w:r>
+        <w:rPr>
+          <w:rFonts w:ascii="Segoe UI" w:hAnsi="Segoe UI" w:cs="Segoe UI"/>
+          <w:sz w:val="24"/>
+          <w:szCs w:val="24"/>
+        </w:rPr>
+        <w:tab/>
+      </w:r>
+      <w:r>
+        <w:rPr>
+          <w:rFonts w:ascii="Segoe UI" w:hAnsi="Segoe UI" w:cs="Segoe UI"/>
+          <w:sz w:val="24"/>
+          <w:szCs w:val="24"/>
+        </w:rPr>
+        <w:tab/>
+      </w:r>
+      <w:r>
+        <w:rPr>
+          <w:rFonts w:ascii="Segoe UI" w:hAnsi="Segoe UI" w:cs="Segoe UI"/>
+          <w:sz w:val="24"/>
+          <w:szCs w:val="24"/>
+        </w:rPr>
+        <w:t xml:space="preserve">                </w:t>
+      </w:r>
+      <w:r>
+        <w:rPr>
+          <w:rFonts w:ascii="Segoe UI" w:hAnsi="Segoe UI" w:cs="Segoe UI"/>
+          <w:i/>
+          <w:iCs/>
+          <w:sz w:val="24"/>
+          <w:szCs w:val="24"/>
+        </w:rPr>
+        <w:t xml:space="preserve"> </w:t>
       </w:r>
       <w:proofErr w:type="gramStart"/>
       <w:r>
         <w:rPr>
           <w:rFonts w:ascii="Segoe UI" w:hAnsi="Segoe UI" w:cs="Segoe UI"/>
-        </w:rPr>
-        <w:t>}</w:t>
-      </w:r>
-      <w:r>
-        <w:rPr>
-          <w:rFonts w:ascii="Segoe UI" w:hAnsi="Segoe UI" w:cs="Segoe UI"/>
-        </w:rPr>
-        <w:t xml:space="preserve"> </w:t>
-      </w:r>
-      <w:r>
-        <w:rPr>
-          <w:rFonts w:ascii="Segoe UI" w:hAnsi="Segoe UI" w:cs="Segoe UI"/>
-        </w:rPr>
-        <w:t xml:space="preserve"> </w:t>
-      </w:r>
-      <w:r>
-        <w:rPr>
-          <w:rFonts w:ascii="Segoe UI" w:hAnsi="Segoe UI" w:cs="Segoe UI"/>
-        </w:rPr>
-        <w:t>dated</w:t>
+          <w:i/>
+          <w:iCs/>
+          <w:sz w:val="24"/>
+          <w:szCs w:val="24"/>
+        </w:rPr>
+        <w:t>for</w:t>
       </w:r>
       <w:proofErr w:type="gramEnd"/>
       <w:r>
         <w:rPr>
           <w:rFonts w:ascii="Segoe UI" w:hAnsi="Segoe UI" w:cs="Segoe UI"/>
-        </w:rPr>
-        <w:t xml:space="preserve"> </w:t>
-      </w:r>
-      <w:r>
-        <w:rPr>
-          <w:rFonts w:ascii="Segoe UI" w:hAnsi="Segoe UI" w:cs="Segoe UI"/>
-        </w:rPr>
-        <w:t>{{PUC_DATE}}</w:t>
-      </w:r>
-      <w:r>
-        <w:rPr>
-          <w:rFonts w:ascii="Segoe UI" w:hAnsi="Segoe UI" w:cs="Segoe UI"/>
-        </w:rPr>
-        <w:t xml:space="preserve"> for information &amp; necessary action.</w:t>
-      </w:r>
-    </w:p>
-    <w:p>
-      <w:pPr>
-        <w:spacing w:after="0" w:line="240" w:lineRule="auto"/>
-        <w:ind w:firstLine="720"/>
-        <w:jc w:val="both"/>
-        <w:rPr>
-          <w:rFonts w:ascii="Segoe UI" w:hAnsi="Segoe UI" w:cs="Segoe UI"/>
-        </w:rPr>
-      </w:pPr>
-    </w:p>
-    <w:p>
-      <w:pPr>
-        <w:spacing w:after="0" w:line="240" w:lineRule="auto"/>
-        <w:ind w:firstLine="720"/>
-        <w:jc w:val="both"/>
-        <w:rPr>
-          <w:rFonts w:ascii="Segoe UI" w:hAnsi="Segoe UI" w:cs="Segoe UI"/>
-        </w:rPr>
-      </w:pPr>
-    </w:p>
-    <w:p>
-      <w:pPr>
-        <w:spacing w:after="0" w:line="240" w:lineRule="auto"/>
-        <w:ind w:left="4320" w:firstLine="720"/>
-        <w:jc w:val="both"/>
-        <w:rPr>
-          <w:rFonts w:ascii="Segoe UI" w:hAnsi="Segoe UI" w:cs="Segoe UI"/>
-        </w:rPr>
-      </w:pPr>
-      <w:r>
-        <w:rPr>
-          <w:rFonts w:ascii="Segoe UI" w:hAnsi="Segoe UI" w:cs="Segoe UI"/>
-        </w:rPr>
-        <w:t xml:space="preserve">       </w:t>
-      </w:r>
-      <w:r>
-        <w:rPr>
-          <w:rFonts w:ascii="Segoe UI" w:hAnsi="Segoe UI" w:cs="Segoe UI"/>
-        </w:rPr>
-        <w:t>Superintendent Industries-II,</w:t>
-      </w:r>
-    </w:p>
-    <w:p>
-      <w:pPr>
-        <w:spacing w:after="0" w:line="240" w:lineRule="auto"/>
-        <w:jc w:val="both"/>
-        <w:rPr>
-          <w:rFonts w:ascii="Segoe UI" w:hAnsi="Segoe UI" w:cs="Segoe UI"/>
-        </w:rPr>
-      </w:pPr>
-      <w:r>
-        <w:rPr>
-          <w:rFonts w:ascii="Segoe UI" w:hAnsi="Segoe UI" w:cs="Segoe UI"/>
-        </w:rPr>
-        <w:tab/>
-      </w:r>
-      <w:r>
-        <w:rPr>
-          <w:rFonts w:ascii="Segoe UI" w:hAnsi="Segoe UI" w:cs="Segoe UI"/>
-        </w:rPr>
-        <w:tab/>
-      </w:r>
-      <w:r>
-        <w:rPr>
-          <w:rFonts w:ascii="Segoe UI" w:hAnsi="Segoe UI" w:cs="Segoe UI"/>
-        </w:rPr>
-        <w:tab/>
-      </w:r>
-      <w:r>
-        <w:rPr>
-          <w:rFonts w:ascii="Segoe UI" w:hAnsi="Segoe UI" w:cs="Segoe UI"/>
-        </w:rPr>
-        <w:tab/>
-      </w:r>
-      <w:r>
-        <w:rPr>
-          <w:rFonts w:ascii="Segoe UI" w:hAnsi="Segoe UI" w:cs="Segoe UI"/>
-        </w:rPr>
-        <w:t xml:space="preserve">                          </w:t>
+          <w:sz w:val="24"/>
+          <w:szCs w:val="24"/>
+        </w:rPr>
+        <w:t xml:space="preserve"> Commissioner &amp; Secretary to </w:t>
+      </w:r>
+      <w:proofErr w:type="spellStart"/>
+      <w:r>
+        <w:rPr>
+          <w:rFonts w:ascii="Segoe UI" w:hAnsi="Segoe UI" w:cs="Segoe UI"/>
+          <w:sz w:val="24"/>
+          <w:szCs w:val="24"/>
+        </w:rPr>
+        <w:t>Govt.of</w:t>
+      </w:r>
+      <w:proofErr w:type="spellEnd"/>
+      <w:r>
+        <w:rPr>
+          <w:rFonts w:ascii="Segoe UI" w:hAnsi="Segoe UI" w:cs="Segoe UI"/>
+          <w:sz w:val="24"/>
+          <w:szCs w:val="24"/>
+        </w:rPr>
+        <w:t xml:space="preserve">  Haryana,</w:t>
+      </w:r>
+    </w:p>
+    <w:p>
+      <w:pPr>
+        <w:spacing w:line="240" w:lineRule="auto"/>
+        <w:rPr>
+          <w:rFonts w:ascii="Segoe UI" w:hAnsi="Segoe UI" w:cs="Segoe UI"/>
+          <w:sz w:val="24"/>
+          <w:szCs w:val="24"/>
+        </w:rPr>
+      </w:pPr>
+      <w:r>
+        <w:rPr>
+          <w:rFonts w:ascii="Segoe UI" w:hAnsi="Segoe UI" w:cs="Segoe UI"/>
+          <w:sz w:val="24"/>
+          <w:szCs w:val="24"/>
+        </w:rPr>
+        <w:tab/>
+      </w:r>
+      <w:r>
+        <w:rPr>
+          <w:rFonts w:ascii="Segoe UI" w:hAnsi="Segoe UI" w:cs="Segoe UI"/>
+          <w:sz w:val="24"/>
+          <w:szCs w:val="24"/>
+        </w:rPr>
+        <w:tab/>
+      </w:r>
+      <w:r>
+        <w:rPr>
+          <w:rFonts w:ascii="Segoe UI" w:hAnsi="Segoe UI" w:cs="Segoe UI"/>
+          <w:sz w:val="24"/>
+          <w:szCs w:val="24"/>
+        </w:rPr>
+        <w:tab/>
+      </w:r>
+      <w:r>
+        <w:rPr>
+          <w:rFonts w:ascii="Segoe UI" w:hAnsi="Segoe UI" w:cs="Segoe UI"/>
+          <w:sz w:val="24"/>
+          <w:szCs w:val="24"/>
+        </w:rPr>
+        <w:tab/>
+      </w:r>
+      <w:r>
+        <w:rPr>
+          <w:rFonts w:ascii="Segoe UI" w:hAnsi="Segoe UI" w:cs="Segoe UI"/>
+          <w:sz w:val="24"/>
+          <w:szCs w:val="24"/>
+        </w:rPr>
+        <w:tab/>
+      </w:r>
+      <w:r>
+        <w:rPr>
+          <w:rFonts w:ascii="Segoe UI" w:hAnsi="Segoe UI" w:cs="Segoe UI"/>
+          <w:sz w:val="24"/>
+          <w:szCs w:val="24"/>
+        </w:rPr>
+        <w:tab/>
+        <w:t xml:space="preserve">              </w:t>
       </w:r>
       <w:proofErr w:type="gramStart"/>
       <w:r>
         <w:rPr>
           <w:rFonts w:ascii="Segoe UI" w:hAnsi="Segoe UI" w:cs="Segoe UI"/>
-        </w:rPr>
-        <w:t>for</w:t>
-      </w:r>
-      <w:proofErr w:type="gramEnd"/>
-      <w:r>
-        <w:rPr>
-          <w:rFonts w:ascii="Segoe UI" w:hAnsi="Segoe UI" w:cs="Segoe UI"/>
-        </w:rPr>
-        <w:t xml:space="preserve"> Commissioner &amp; Secretary to </w:t>
-      </w:r>
-      <w:proofErr w:type="spellStart"/>
-      <w:r>
-        <w:rPr>
-          <w:rFonts w:ascii="Segoe UI" w:hAnsi="Segoe UI" w:cs="Segoe UI"/>
-        </w:rPr>
-        <w:t>Govt.of</w:t>
-      </w:r>
-      <w:proofErr w:type="spellEnd"/>
-      <w:r>
-        <w:rPr>
-          <w:rFonts w:ascii="Segoe UI" w:hAnsi="Segoe UI" w:cs="Segoe UI"/>
-        </w:rPr>
-        <w:t xml:space="preserve">  Haryana,</w:t>
-      </w:r>
-    </w:p>
-    <w:p>
-      <w:pPr>
-        <w:spacing w:line="240" w:lineRule="auto"/>
-        <w:rPr>
-          <w:rFonts w:ascii="Segoe UI" w:hAnsi="Segoe UI" w:cs="Segoe UI"/>
-        </w:rPr>
-      </w:pPr>
-      <w:r>
-        <w:rPr>
-          <w:rFonts w:ascii="Segoe UI" w:hAnsi="Segoe UI" w:cs="Segoe UI"/>
-        </w:rPr>
-        <w:tab/>
-      </w:r>
-      <w:r>
-        <w:rPr>
-          <w:rFonts w:ascii="Segoe UI" w:hAnsi="Segoe UI" w:cs="Segoe UI"/>
-        </w:rPr>
-        <w:tab/>
-      </w:r>
-      <w:r>
-        <w:rPr>
-          <w:rFonts w:ascii="Segoe UI" w:hAnsi="Segoe UI" w:cs="Segoe UI"/>
-        </w:rPr>
-        <w:tab/>
-      </w:r>
-      <w:r>
-        <w:rPr>
-          <w:rFonts w:ascii="Segoe UI" w:hAnsi="Segoe UI" w:cs="Segoe UI"/>
-        </w:rPr>
-        <w:tab/>
-      </w:r>
-      <w:r>
-        <w:rPr>
-          <w:rFonts w:ascii="Segoe UI" w:hAnsi="Segoe UI" w:cs="Segoe UI"/>
-        </w:rPr>
-        <w:tab/>
-      </w:r>
-      <w:r>
-        <w:rPr>
-          <w:rFonts w:ascii="Segoe UI" w:hAnsi="Segoe UI" w:cs="Segoe UI"/>
-        </w:rPr>
-        <w:tab/>
-      </w:r>
-      <w:r>
-        <w:rPr>
-          <w:rFonts w:ascii="Segoe UI" w:hAnsi="Segoe UI" w:cs="Segoe UI"/>
-        </w:rPr>
-        <w:t xml:space="preserve">              </w:t>
-      </w:r>
-      <w:proofErr w:type="gramStart"/>
-      <w:r>
-        <w:rPr>
-          <w:rFonts w:ascii="Segoe UI" w:hAnsi="Segoe UI" w:cs="Segoe UI"/>
+          <w:sz w:val="24"/>
+          <w:szCs w:val="24"/>
         </w:rPr>
         <w:t>Industries &amp; Commerce Department.</w:t>
       </w:r>

</xml_diff>

<commit_message>
change in multi draft and single draft
</commit_message>
<xml_diff>
--- a/files/Multi_Draft.docx
+++ b/files/Multi_Draft.docx
@@ -1005,13 +1005,31 @@
         </w:rPr>
         <w:tab/>
       </w:r>
-      <w:r>
-        <w:rPr>
-          <w:rFonts w:ascii="Segoe UI" w:hAnsi="Segoe UI" w:cs="Segoe UI"/>
-          <w:sz w:val="24"/>
-          <w:szCs w:val="24"/>
-        </w:rPr>
-        <w:t>I have been directed to send a copy of letter no. {{PUC_NUMBER}} dated {{PUC_DATE}} received from {{PUC_SENDER}} for further necessary action and send the requisite information directly to the concerned under the intimation to this office</w:t>
+      <w:proofErr w:type="spellStart"/>
+      <w:r>
+        <w:rPr>
+          <w:rFonts w:ascii="Segoe UI" w:hAnsi="Segoe UI" w:cs="Segoe UI"/>
+          <w:sz w:val="24"/>
+          <w:szCs w:val="24"/>
+        </w:rPr>
+        <w:t>Plesae</w:t>
+      </w:r>
+      <w:proofErr w:type="spellEnd"/>
+      <w:r>
+        <w:rPr>
+          <w:rFonts w:ascii="Segoe UI" w:hAnsi="Segoe UI" w:cs="Segoe UI"/>
+          <w:sz w:val="24"/>
+          <w:szCs w:val="24"/>
+        </w:rPr>
+        <w:t xml:space="preserve"> find enclosed herewith</w:t>
+      </w:r>
+      <w:r>
+        <w:rPr>
+          <w:rFonts w:ascii="Segoe UI" w:hAnsi="Segoe UI" w:cs="Segoe UI"/>
+          <w:sz w:val="24"/>
+          <w:szCs w:val="24"/>
+        </w:rPr>
+        <w:t xml:space="preserve"> a copy of letter no. {{PUC_NUMBER}} dated {{PUC_DATE}} received from {{PUC_SENDER}} for further necessary action and send the requisite information directly to the concerned under the intimation to this office</w:t>
       </w:r>
       <w:r>
         <w:rPr>

</xml_diff>